<commit_message>
Adapt grant dashboard for small local foundation awards and custom outcome tracking
</commit_message>
<xml_diff>
--- a/public/Nami_Grant_Quick_Start.docx
+++ b/public/Nami_Grant_Quick_Start.docx
@@ -3,12 +3,12 @@
 <w:document xmlns:wpc="http://schemas.microsoft.com/office/word/2010/wordprocessingCanvas" xmlns:mo="http://schemas.microsoft.com/office/mac/office/2008/main" xmlns:mc="http://schemas.openxmlformats.org/markup-compatibility/2006" xmlns:mv="urn:schemas-microsoft-com:mac:vml" xmlns:o="urn:schemas-microsoft-com:office:office" xmlns:r="http://schemas.openxmlformats.org/officeDocument/2006/relationships" xmlns:m="http://schemas.openxmlformats.org/officeDocument/2006/math" xmlns:v="urn:schemas-microsoft-com:vml" xmlns:wp14="http://schemas.microsoft.com/office/word/2010/wordprocessingDrawing" xmlns:wp="http://schemas.openxmlformats.org/drawingml/2006/wordprocessingDrawing" xmlns:w10="urn:schemas-microsoft-com:office:word" xmlns:w="http://schemas.openxmlformats.org/wordprocessingml/2006/main" xmlns:w14="http://schemas.microsoft.com/office/word/2010/wordml" xmlns:wpg="http://schemas.microsoft.com/office/word/2010/wordprocessingGroup" xmlns:wpi="http://schemas.microsoft.com/office/word/2010/wordprocessingInk" xmlns:wne="http://schemas.microsoft.com/office/word/2006/wordml" xmlns:wps="http://schemas.microsoft.com/office/word/2010/wordprocessingShape" mc:Ignorable="w14 wp14">
   <w:body>
     <w:p>
-      <w:bookmarkStart w:id="1" w:name="nami-grant-workspace-quick-start"/>
+      <w:bookmarkStart w:id="1" w:name="nami-local-foundation-grants--quick-start"/>
       <w:pPr>
         <w:pStyle w:val="Title"/>
       </w:pPr>
       <w:r>
-        <w:t>Nami Grant Workspace Quick Start</w:t>
+        <w:t>Nami Local Foundation Grants — Quick Start</w:t>
       </w:r>
       <w:bookmarkEnd w:id="1"/>
     </w:p>
@@ -18,7 +18,7 @@
         <w:rPr>
           <w:b w:val="0"/>
         </w:rPr>
-        <w:t>Associate Director guide · 2026-09-11 · onboarding-v1</w:t>
+        <w:t>Associate Director guide · 2026-09-12 · local-foundation-v1</w:t>
       </w:r>
     </w:p>
     <w:p>
@@ -27,7 +27,7 @@
         <w:rPr>
           <w:b w:val="0"/>
         </w:rPr>
-        <w:t>This public prototype is for synthetic evaluation only. Neither workspace is an access boundary. No agency accounts are connected.</w:t>
+        <w:t>This public prototype is for synthetic evaluation. Workspace and owner labels do not protect confidential information. No agency accounts are connected.</w:t>
       </w:r>
     </w:p>
     <w:p>
@@ -42,13 +42,13 @@
         <w:rPr>
           <w:b/>
         </w:rPr>
-        <w:t>Orient yourself.</w:t>
+        <w:t>Get oriented.</w:t>
       </w:r>
       <w:r>
         <w:rPr>
           <w:b w:val="0"/>
         </w:rPr>
-        <w:t xml:space="preserve"> Complete or skip the first-visit orientation. Help → Reopen onboarding brings it back. Start guided demo tours fictional scenarios separately.</w:t>
+        <w:t xml:space="preserve"> Complete or skip onboarding. Help → Reopen onboarding brings it back. The guided demo is a separate tour; Help includes the manual and downloads.</w:t>
       </w:r>
     </w:p>
     <w:p>
@@ -63,13 +63,13 @@
         <w:rPr>
           <w:b/>
         </w:rPr>
-        <w:t>Choose Sample workspace.</w:t>
+        <w:t>Set up each award.</w:t>
       </w:r>
       <w:r>
         <w:rPr>
           <w:b w:val="0"/>
         </w:rPr>
-        <w:t xml:space="preserve"> Use Records at the top. Orientation never resets data. If samples are empty, Load sample portfolio; reset only after exporting changes and confirming.</w:t>
+        <w:t xml:space="preserve"> In Sample workspace, choose Add grant or Overview → Set up a grant. Try a $5,000 sample grant opens a fictional draft without resetting existing records.</w:t>
       </w:r>
     </w:p>
     <w:p>
@@ -84,13 +84,13 @@
         <w:rPr>
           <w:b/>
         </w:rPr>
-        <w:t>Review Needs Attention.</w:t>
+        <w:t>Record the basics.</w:t>
       </w:r>
       <w:r>
         <w:rPr>
           <w:b w:val="0"/>
         </w:rPr>
-        <w:t xml:space="preserve"> Choose Overview. Open queue rows to inspect owners, deadlines and reasons. A blank queue does not prove compliance or complete award coverage.</w:t>
+        <w:t xml:space="preserve"> Step 1: grant name, foundation, owner, amount, awarded date, start and end dates. Use Pending for unconfirmed funding; new grants otherwise default to Active.</w:t>
       </w:r>
     </w:p>
     <w:p>
@@ -105,13 +105,13 @@
         <w:rPr>
           <w:b/>
         </w:rPr>
-        <w:t>Inspect a grant.</w:t>
+        <w:t>Choose your measures.</w:t>
       </w:r>
       <w:r>
         <w:rPr>
           <w:b w:val="0"/>
         </w:rPr>
-        <w:t xml:space="preserve"> Choose Grants and search titles, owners or notes. Open a grant to see its requirements, tasks and issues. Edit record saves changes; Status → Archived retains the record.</w:t>
+        <w:t xml:space="preserve"> Step 2: rename Families served, People served and Outcome data, or add custom Number, Short text, Long text, Date or Link fields. Set targets, collection owners, counting rules and due dates. Hide unused fields without deleting their data.</w:t>
       </w:r>
     </w:p>
     <w:p>
@@ -126,13 +126,13 @@
         <w:rPr>
           <w:b/>
         </w:rPr>
-        <w:t>Follow prerequisites.</w:t>
+        <w:t>Capture the story.</w:t>
       </w:r>
       <w:r>
         <w:rPr>
           <w:b w:val="0"/>
         </w:rPr>
-        <w:t xml:space="preserve"> Open Government monthly expenditure report and its Depends on task. Complete the prerequisite first, then review the requirement separately. Dates do not shift automatically.</w:t>
+        <w:t xml:space="preserve"> Add ZIP-code counts, payment recipients/purposes, success stories and photo URLs as needed. Counts are aggregate. Photos are links only. ZIP counts do not update measure totals; payments do not update the separate financial snapshot.</w:t>
       </w:r>
     </w:p>
     <w:p>
@@ -147,13 +147,13 @@
         <w:rPr>
           <w:b/>
         </w:rPr>
-        <w:t>Verify evidence.</w:t>
+        <w:t>List the commitments.</w:t>
       </w:r>
       <w:r>
         <w:rPr>
           <w:b w:val="0"/>
         </w:rPr>
-        <w:t xml:space="preserve"> A requirement needs a Source / evidence URL before completion. A link is not proof. Source verified on is a manual assertion; more than 30 days old is STALE, absent is UNKNOWN.</w:t>
+        <w:t xml:space="preserve"> Step 3: Add report / requirement, deadline, owner and needed data. One final report may suffice. Set a dated staff assessment when justified. Save grant creates the award and its requirements together.</w:t>
       </w:r>
     </w:p>
     <w:p>
@@ -168,13 +168,13 @@
         <w:rPr>
           <w:b/>
         </w:rPr>
-        <w:t>Separate finance and issues.</w:t>
+        <w:t>Track progress.</w:t>
       </w:r>
       <w:r>
         <w:rPr>
           <w:b w:val="0"/>
         </w:rPr>
-        <w:t xml:space="preserve"> Finances shows manual totals and snapshot dates, not reconciled accounting. Issues records severity and escalation owner; escalation sends no notification.</w:t>
+        <w:t xml:space="preserve"> Open a grant card. Review outcome targets and the requirements bar separately. Overdue requirements or missed dated numeric targets show Needs attention; an old assessment shows Review due. No data or checklist proves compliance.</w:t>
       </w:r>
     </w:p>
     <w:p>
@@ -189,13 +189,13 @@
         <w:rPr>
           <w:b/>
         </w:rPr>
-        <w:t>Review leads.</w:t>
+        <w:t>Keep it current.</w:t>
       </w:r>
       <w:r>
         <w:rPr>
           <w:b w:val="0"/>
         </w:rPr>
-        <w:t xml:space="preserve"> Grant Radar → open a lead → Promote to pending award creates an unconfirmed Pending grant, not awarded funding.</w:t>
+        <w:t xml:space="preserve"> Edit setup &amp; tracking changes grant fields. Open reports to edit evidence or prerequisites. A requirement needs an evidence URL and a completed prerequisite before completion. Completing staff work does not complete the report.</w:t>
       </w:r>
     </w:p>
     <w:p>
@@ -210,13 +210,13 @@
         <w:rPr>
           <w:b/>
         </w:rPr>
-        <w:t>Preserve changes.</w:t>
+        <w:t>Preserve your work.</w:t>
       </w:r>
       <w:r>
         <w:rPr>
           <w:b w:val="0"/>
         </w:rPr>
-        <w:t xml:space="preserve"> Settings → Export records saves selected-workspace JSON. Choose JSON imports 1–100 records additively; it rejects duplicates and cannot restore or overwrite a workspace.</w:t>
+        <w:t xml:space="preserve"> Settings → Export records includes custom tracking. JSON import is additive (1–100 records), rejects duplicates and cannot restore a workspace. Reset demo data requires explicit confirmation and replaces all shared samples; export first.</w:t>
       </w:r>
     </w:p>
     <w:p>
@@ -230,21 +230,13 @@
         <w:rPr>
           <w:b/>
         </w:rPr>
-        <w:t>Help and next steps</w:t>
+        <w:t>Next steps:</w:t>
       </w:r>
       <w:r>
         <w:rPr>
           <w:b w:val="0"/>
         </w:rPr>
-      </w:r>
-    </w:p>
-    <w:p>
-      <w:pPr/>
-      <w:r>
-        <w:rPr>
-          <w:b w:val="0"/>
-        </w:rPr>
-        <w:t>Help provides the full online manual and Word/PDF downloads. Settings lists future integrations marked Requires agency configuration. Use HANDOFF.md for agency adoption, security, source verification and recovery requirements. All practice edits must remain synthetic.</w:t>
+        <w:t xml:space="preserve"> Use Grants to search titles, owners and notes, including archived grants. Expand Portfolio totals &amp; detailed attention queue for broader flags. Review finances and issues separately; escalation sends no message. Help has the full manual. Agency adoption and integrations require administrative configuration.</w:t>
       </w:r>
     </w:p>
     <w:sectPr>

</xml_diff>

<commit_message>
Rewrite the manual, quick start and presenter script for the simple version
- USER_MANUAL.md: Part 1 in plain words for everyone (welcome, the four
  pages, tips, next step, adding grants and reports, marking done, what
  the words mean); Part 2 for the administrator (More tools, backups,
  privacy and limits, the checklist before real grants).
- QUICKSTART.md fits one page; PRESENTER.md is a five-minute script.
- Regenerated manual.html, quickstart.html, Word and PDF copies. HTML
  bullets now render as bullets. PDFs printed from the HTML with Chromium.
- README no longer says the manuals are out of date.

Co-Authored-By: Claude Opus 5.5 <noreply@anthropic.com>
Claude-Session: https://claude.ai/code/session_017CUduoL5RTZp1B2SXgs2Ce
</commit_message>
<xml_diff>
--- a/public/Nami_Grant_Quick_Start.docx
+++ b/public/Nami_Grant_Quick_Start.docx
@@ -3,12 +3,12 @@
 <w:document xmlns:wpc="http://schemas.microsoft.com/office/word/2010/wordprocessingCanvas" xmlns:mo="http://schemas.microsoft.com/office/mac/office/2008/main" xmlns:mc="http://schemas.openxmlformats.org/markup-compatibility/2006" xmlns:mv="urn:schemas-microsoft-com:mac:vml" xmlns:o="urn:schemas-microsoft-com:office:office" xmlns:r="http://schemas.openxmlformats.org/officeDocument/2006/relationships" xmlns:m="http://schemas.openxmlformats.org/officeDocument/2006/math" xmlns:v="urn:schemas-microsoft-com:vml" xmlns:wp14="http://schemas.microsoft.com/office/word/2010/wordprocessingDrawing" xmlns:wp="http://schemas.openxmlformats.org/drawingml/2006/wordprocessingDrawing" xmlns:w10="urn:schemas-microsoft-com:office:word" xmlns:w="http://schemas.openxmlformats.org/wordprocessingml/2006/main" xmlns:w14="http://schemas.microsoft.com/office/word/2010/wordml" xmlns:wpg="http://schemas.microsoft.com/office/word/2010/wordprocessingGroup" xmlns:wpi="http://schemas.microsoft.com/office/word/2010/wordprocessingInk" xmlns:wne="http://schemas.microsoft.com/office/word/2006/wordml" xmlns:wps="http://schemas.microsoft.com/office/word/2010/wordprocessingShape" mc:Ignorable="w14 wp14">
   <w:body>
     <w:p>
-      <w:bookmarkStart w:id="1" w:name="nami-local-foundation-grants--quick-start"/>
+      <w:bookmarkStart w:id="1" w:name="nami-grant-workspace--quick-start"/>
       <w:pPr>
         <w:pStyle w:val="Title"/>
       </w:pPr>
       <w:r>
-        <w:t>Nami Local Foundation Grants — Quick Start</w:t>
+        <w:t>Nami Grant Workspace — Quick Start</w:t>
       </w:r>
       <w:bookmarkEnd w:id="1"/>
     </w:p>
@@ -18,7 +18,7 @@
         <w:rPr>
           <w:b w:val="0"/>
         </w:rPr>
-        <w:t>Associate Director guide · 2026-09-12 · local-foundation-v1</w:t>
+        <w:t>One page · 2026-10-05 · simple-v2</w:t>
       </w:r>
     </w:p>
     <w:p>
@@ -27,7 +27,7 @@
         <w:rPr>
           <w:b w:val="0"/>
         </w:rPr>
-        <w:t>This public prototype is for synthetic evaluation. Workspace and owner labels do not protect confidential information. No agency accounts are connected.</w:t>
+        <w:t>The workspace keeps track of your grants, the reports each funder asks for, and when they are due. This is a public test site, so please don't type private details about the people you serve.</w:t>
       </w:r>
     </w:p>
     <w:p>
@@ -42,13 +42,37 @@
         <w:rPr>
           <w:b/>
         </w:rPr>
-        <w:t>Get oriented.</w:t>
+        <w:t>Open it and follow the welcome.</w:t>
       </w:r>
       <w:r>
         <w:rPr>
           <w:b w:val="0"/>
         </w:rPr>
-        <w:t xml:space="preserve"> Complete or skip onboarding. Help → Reopen onboarding brings it back. The guided demo is a separate tour; Help includes the manual and downloads.</w:t>
+        <w:t xml:space="preserve"> Three short steps. Choose </w:t>
+      </w:r>
+      <w:r>
+        <w:rPr>
+          <w:b/>
+        </w:rPr>
+        <w:t>Practice with made-up grants</w:t>
+      </w:r>
+      <w:r>
+        <w:rPr>
+          <w:b w:val="0"/>
+        </w:rPr>
+        <w:t xml:space="preserve"> to try things safely, or </w:t>
+      </w:r>
+      <w:r>
+        <w:rPr>
+          <w:b/>
+        </w:rPr>
+        <w:t>Add our first grant</w:t>
+      </w:r>
+      <w:r>
+        <w:rPr>
+          <w:b w:val="0"/>
+        </w:rPr>
+        <w:t>.</w:t>
       </w:r>
     </w:p>
     <w:p>
@@ -63,13 +87,25 @@
         <w:rPr>
           <w:b/>
         </w:rPr>
-        <w:t>Set up each award.</w:t>
+        <w:t>Start on Home.</w:t>
       </w:r>
       <w:r>
         <w:rPr>
           <w:b w:val="0"/>
         </w:rPr>
-        <w:t xml:space="preserve"> In Sample workspace, choose Add grant or Overview → Set up a grant. Try a $5,000 sample grant opens a fictional draft without resetting existing records.</w:t>
+        <w:t xml:space="preserve"> </w:t>
+      </w:r>
+      <w:r>
+        <w:rPr>
+          <w:b/>
+        </w:rPr>
+        <w:t>Your next step</w:t>
+      </w:r>
+      <w:r>
+        <w:rPr>
+          <w:b w:val="0"/>
+        </w:rPr>
+        <w:t xml:space="preserve"> always shows one thing to do, with one button. Below it are your grants and what's coming up.</w:t>
       </w:r>
     </w:p>
     <w:p>
@@ -84,13 +120,37 @@
         <w:rPr>
           <w:b/>
         </w:rPr>
-        <w:t>Record the basics.</w:t>
+        <w:t>Add a grant.</w:t>
       </w:r>
       <w:r>
         <w:rPr>
           <w:b w:val="0"/>
         </w:rPr>
-        <w:t xml:space="preserve"> Step 1: grant name, foundation, owner, amount, awarded date, start and end dates. Use Pending for unconfirmed funding; new grants otherwise default to Active.</w:t>
+        <w:t xml:space="preserve"> Press </w:t>
+      </w:r>
+      <w:r>
+        <w:rPr>
+          <w:b/>
+        </w:rPr>
+        <w:t>Add a grant</w:t>
+      </w:r>
+      <w:r>
+        <w:rPr>
+          <w:b w:val="0"/>
+        </w:rPr>
+        <w:t xml:space="preserve">. Only the name is needed. Press </w:t>
+      </w:r>
+      <w:r>
+        <w:rPr>
+          <w:b/>
+        </w:rPr>
+        <w:t>Save now</w:t>
+      </w:r>
+      <w:r>
+        <w:rPr>
+          <w:b w:val="0"/>
+        </w:rPr>
+        <w:t xml:space="preserve"> to finish later, or go through the three steps: the basics, what the funder wants to know, and reports with their due dates. A Final report is filled in for you.</w:t>
       </w:r>
     </w:p>
     <w:p>
@@ -105,13 +165,25 @@
         <w:rPr>
           <w:b/>
         </w:rPr>
-        <w:t>Choose your measures.</w:t>
+        <w:t>Add a report.</w:t>
       </w:r>
       <w:r>
         <w:rPr>
           <w:b w:val="0"/>
         </w:rPr>
-        <w:t xml:space="preserve"> Step 2: rename Families served, People served and Outcome data, or add custom Number, Short text, Long text, Date or Link fields. Set targets, collection owners, counting rules and due dates. Hide unused fields without deleting their data.</w:t>
+        <w:t xml:space="preserve"> Open the grant and press </w:t>
+      </w:r>
+      <w:r>
+        <w:rPr>
+          <w:b/>
+        </w:rPr>
+        <w:t>Add a report or due date</w:t>
+      </w:r>
+      <w:r>
+        <w:rPr>
+          <w:b w:val="0"/>
+        </w:rPr>
+        <w:t>. Give it a name, a date, and who is doing it.</w:t>
       </w:r>
     </w:p>
     <w:p>
@@ -126,13 +198,25 @@
         <w:rPr>
           <w:b/>
         </w:rPr>
-        <w:t>Capture the story.</w:t>
+        <w:t>Mark it done.</w:t>
       </w:r>
       <w:r>
         <w:rPr>
           <w:b w:val="0"/>
         </w:rPr>
-        <w:t xml:space="preserve"> Add ZIP-code counts, payment recipients/purposes, success stories and photo URLs as needed. Counts are aggregate. Photos are links only. ZIP counts do not update measure totals; payments do not update the separate financial snapshot.</w:t>
+        <w:t xml:space="preserve"> Open it from the To-do list and press </w:t>
+      </w:r>
+      <w:r>
+        <w:rPr>
+          <w:b/>
+        </w:rPr>
+        <w:t>Mark done</w:t>
+      </w:r>
+      <w:r>
+        <w:rPr>
+          <w:b w:val="0"/>
+        </w:rPr>
+        <w:t>. A funder requirement asks for a link to what you sent; paste it in the box that appears.</w:t>
       </w:r>
     </w:p>
     <w:p>
@@ -147,13 +231,37 @@
         <w:rPr>
           <w:b/>
         </w:rPr>
-        <w:t>List the commitments.</w:t>
+        <w:t>Use the tips.</w:t>
       </w:r>
       <w:r>
         <w:rPr>
           <w:b w:val="0"/>
         </w:rPr>
-        <w:t xml:space="preserve"> Step 3: Add report / requirement, deadline, owner and needed data. One final report may suffice. Set a dated staff assessment when justified. Save grant creates the award and its requirements together.</w:t>
+        <w:t xml:space="preserve"> Each page has one short tip. Press </w:t>
+      </w:r>
+      <w:r>
+        <w:rPr>
+          <w:b/>
+        </w:rPr>
+        <w:t>Got it</w:t>
+      </w:r>
+      <w:r>
+        <w:rPr>
+          <w:b w:val="0"/>
+        </w:rPr>
+        <w:t xml:space="preserve"> to put it away, or </w:t>
+      </w:r>
+      <w:r>
+        <w:rPr>
+          <w:b/>
+        </w:rPr>
+        <w:t>Later</w:t>
+      </w:r>
+      <w:r>
+        <w:rPr>
+          <w:b w:val="0"/>
+        </w:rPr>
+        <w:t xml:space="preserve"> to see it tomorrow.</w:t>
       </w:r>
     </w:p>
     <w:p>
@@ -168,55 +276,37 @@
         <w:rPr>
           <w:b/>
         </w:rPr>
-        <w:t>Track progress.</w:t>
+        <w:t>Need more?</w:t>
       </w:r>
       <w:r>
         <w:rPr>
           <w:b w:val="0"/>
         </w:rPr>
-        <w:t xml:space="preserve"> Open a grant card. Review outcome targets and the requirements bar separately. Overdue requirements or missed dated numeric targets show Needs attention; an old assessment shows Review due. No data or checklist proves compliance.</w:t>
-      </w:r>
-    </w:p>
-    <w:p>
-      <w:pPr/>
-      <w:r>
-        <w:rPr>
-          <w:b w:val="0"/>
-        </w:rPr>
-        <w:t xml:space="preserve">8. </w:t>
+        <w:t xml:space="preserve"> </w:t>
       </w:r>
       <w:r>
         <w:rPr>
           <w:b/>
         </w:rPr>
-        <w:t>Keep it current.</w:t>
+        <w:t>More tools</w:t>
       </w:r>
       <w:r>
         <w:rPr>
           <w:b w:val="0"/>
         </w:rPr>
-        <w:t xml:space="preserve"> Edit setup &amp; tracking changes grant fields. Open reports to edit evidence or prerequisites. A requirement needs an evidence URL and a completed prerequisite before completion. Completing staff work does not complete the report.</w:t>
-      </w:r>
-    </w:p>
-    <w:p>
-      <w:pPr/>
-      <w:r>
-        <w:rPr>
-          <w:b w:val="0"/>
-        </w:rPr>
-        <w:t xml:space="preserve">9. </w:t>
+        <w:t xml:space="preserve">, at the bottom of the menu, has Money, Problems, Grant Radar, and Settings &amp; backup. </w:t>
       </w:r>
       <w:r>
         <w:rPr>
           <w:b/>
         </w:rPr>
-        <w:t>Preserve your work.</w:t>
+        <w:t>Help</w:t>
       </w:r>
       <w:r>
         <w:rPr>
           <w:b w:val="0"/>
         </w:rPr>
-        <w:t xml:space="preserve"> Settings → Export records includes custom tracking. JSON import is additive (1–100 records), rejects duplicates and cannot restore a workspace. Reset demo data requires explicit confirmation and replaces all shared samples; export first.</w:t>
+        <w:t xml:space="preserve"> answers common questions.</w:t>
       </w:r>
     </w:p>
     <w:p>
@@ -230,13 +320,45 @@
         <w:rPr>
           <w:b/>
         </w:rPr>
-        <w:t>Next steps:</w:t>
+        <w:t>Practice or real:</w:t>
       </w:r>
       <w:r>
         <w:rPr>
           <w:b w:val="0"/>
         </w:rPr>
-        <w:t xml:space="preserve"> Use Grants to search titles, owners and notes, including archived grants. Expand Portfolio totals &amp; detailed attention queue for broader flags. Review finances and issues separately; escalation sends no message. Help has the full manual. Agency adoption and integrations require administrative configuration.</w:t>
+        <w:t xml:space="preserve"> use </w:t>
+      </w:r>
+      <w:r>
+        <w:rPr>
+          <w:b/>
+        </w:rPr>
+        <w:t>Showing</w:t>
+      </w:r>
+      <w:r>
+        <w:rPr>
+          <w:b w:val="0"/>
+        </w:rPr>
+        <w:t xml:space="preserve"> at the top right to switch between Practice grants (made up) and Our grants. They are kept separate.</w:t>
+      </w:r>
+    </w:p>
+    <w:p>
+      <w:pPr/>
+      <w:r>
+        <w:rPr>
+          <w:b w:val="0"/>
+        </w:rPr>
+      </w:r>
+      <w:r>
+        <w:rPr>
+          <w:b/>
+        </w:rPr>
+        <w:t>Full manual:</w:t>
+      </w:r>
+      <w:r>
+        <w:rPr>
+          <w:b w:val="0"/>
+        </w:rPr>
+        <w:t xml:space="preserve"> open Help, then Full user manual.</w:t>
       </w:r>
     </w:p>
     <w:sectPr>

</xml_diff>